<commit_message>
Updated to add Organization Type to define partner types
</commit_message>
<xml_diff>
--- a/PRDs/CBM-PRD-CRM-Partners.docx
+++ b/PRDs/CBM-PRD-CRM-Partners.docx
@@ -1590,7 +1590,7 @@
                 <w:sz w:val="22"/>
                 <w:szCs w:val="22"/>
               </w:rPr>
-              <w:t xml:space="preserve">Partner Type(s)</w:t>
+              <w:t xml:space="preserve">Organization Type</w:t>
             </w:r>
           </w:p>
         </w:tc>
@@ -1621,7 +1621,7 @@
                 <w:sz w:val="22"/>
                 <w:szCs w:val="22"/>
               </w:rPr>
-              <w:t xml:space="preserve">Multi-select</w:t>
+              <w:t xml:space="preserve">Dropdown</w:t>
             </w:r>
           </w:p>
         </w:tc>
@@ -1652,7 +1652,7 @@
                 <w:sz w:val="22"/>
                 <w:szCs w:val="22"/>
               </w:rPr>
-              <w:t xml:space="preserve">One or more of: Referral Partner, Co-Delivery Partner, Funding/Sponsorship Partner, Resource Partner. Required.</w:t>
+              <w:t xml:space="preserve">The category of organization. Values: Chamber of Commerce, Small Business Development Center (SBDC), Economic Development Agency, University / Academic Institution, Bank / Financial Institution, Nonprofit / Community Organization, Government Agency, Corporate Sponsor, Other. Required.</w:t>
             </w:r>
           </w:p>
         </w:tc>
@@ -1685,7 +1685,7 @@
                 <w:sz w:val="22"/>
                 <w:szCs w:val="22"/>
               </w:rPr>
-              <w:t xml:space="preserve">Partner Status</w:t>
+              <w:t xml:space="preserve">Partner Type(s)</w:t>
             </w:r>
           </w:p>
         </w:tc>
@@ -1716,7 +1716,7 @@
                 <w:sz w:val="22"/>
                 <w:szCs w:val="22"/>
               </w:rPr>
-              <w:t xml:space="preserve">Dropdown</w:t>
+              <w:t xml:space="preserve">Multi-select</w:t>
             </w:r>
           </w:p>
         </w:tc>
@@ -1747,7 +1747,7 @@
                 <w:sz w:val="22"/>
                 <w:szCs w:val="22"/>
               </w:rPr>
-              <w:t xml:space="preserve">Prospect, Active, Lapsed, Inactive. Required.</w:t>
+              <w:t xml:space="preserve">One or more of: Referral Partner, Co-Delivery Partner, Funding/Sponsorship Partner, Resource Partner. Required.</w:t>
             </w:r>
           </w:p>
         </w:tc>
@@ -1780,7 +1780,7 @@
                 <w:sz w:val="22"/>
                 <w:szCs w:val="22"/>
               </w:rPr>
-              <w:t xml:space="preserve">Partnership Start Date</w:t>
+              <w:t xml:space="preserve">Partner Status</w:t>
             </w:r>
           </w:p>
         </w:tc>
@@ -1811,7 +1811,7 @@
                 <w:sz w:val="22"/>
                 <w:szCs w:val="22"/>
               </w:rPr>
-              <w:t xml:space="preserve">Date</w:t>
+              <w:t xml:space="preserve">Dropdown</w:t>
             </w:r>
           </w:p>
         </w:tc>
@@ -1842,7 +1842,7 @@
                 <w:sz w:val="22"/>
                 <w:szCs w:val="22"/>
               </w:rPr>
-              <w:t xml:space="preserve">The date the partnership was formally established. Optional for Prospects; required when status moves to Active.</w:t>
+              <w:t xml:space="preserve">Prospect, Active, Lapsed, Inactive. Required.</w:t>
             </w:r>
           </w:p>
         </w:tc>
@@ -1875,7 +1875,7 @@
                 <w:sz w:val="22"/>
                 <w:szCs w:val="22"/>
               </w:rPr>
-              <w:t xml:space="preserve">Parent Organization</w:t>
+              <w:t xml:space="preserve">Partnership Start Date</w:t>
             </w:r>
           </w:p>
         </w:tc>
@@ -1906,7 +1906,7 @@
                 <w:sz w:val="22"/>
                 <w:szCs w:val="22"/>
               </w:rPr>
-              <w:t xml:space="preserve">Relationship</w:t>
+              <w:t xml:space="preserve">Date</w:t>
             </w:r>
           </w:p>
         </w:tc>
@@ -1937,7 +1937,7 @@
                 <w:sz w:val="22"/>
                 <w:szCs w:val="22"/>
               </w:rPr>
-              <w:t xml:space="preserve">Link to another Partner record that is the parent organization. Used for branches, chapters, or subsidiaries. Optional.</w:t>
+              <w:t xml:space="preserve">The date the partnership was formally established. Optional for Prospects; required when status moves to Active.</w:t>
             </w:r>
           </w:p>
         </w:tc>
@@ -1970,7 +1970,7 @@
                 <w:sz w:val="22"/>
                 <w:szCs w:val="22"/>
               </w:rPr>
-              <w:t xml:space="preserve">Assigned Liaison</w:t>
+              <w:t xml:space="preserve">Parent Organization</w:t>
             </w:r>
           </w:p>
         </w:tc>
@@ -2032,7 +2032,7 @@
                 <w:sz w:val="22"/>
                 <w:szCs w:val="22"/>
               </w:rPr>
-              <w:t xml:space="preserve">The CBM member (mentor, staff, or board) responsible for managing this Partner relationship. Required for Active partners.</w:t>
+              <w:t xml:space="preserve">Link to another Partner record that is the parent organization. Used for branches, chapters, or subsidiaries. Optional.</w:t>
             </w:r>
           </w:p>
         </w:tc>
@@ -2065,7 +2065,7 @@
                 <w:sz w:val="22"/>
                 <w:szCs w:val="22"/>
               </w:rPr>
-              <w:t xml:space="preserve">Public Announcement Allowed</w:t>
+              <w:t xml:space="preserve">Assigned Liaison</w:t>
             </w:r>
           </w:p>
         </w:tc>
@@ -2096,7 +2096,7 @@
                 <w:sz w:val="22"/>
                 <w:szCs w:val="22"/>
               </w:rPr>
-              <w:t xml:space="preserve">Yes/No</w:t>
+              <w:t xml:space="preserve">Relationship</w:t>
             </w:r>
           </w:p>
         </w:tc>
@@ -2127,7 +2127,7 @@
                 <w:sz w:val="22"/>
                 <w:szCs w:val="22"/>
               </w:rPr>
-              <w:t xml:space="preserve">Whether CBM may publicly announce or reference this partnership in its marketing and communications. Defaults to No.</w:t>
+              <w:t xml:space="preserve">The CBM member (mentor, staff, or board) responsible for managing this Partner relationship. Required for Active partners.</w:t>
             </w:r>
           </w:p>
         </w:tc>
@@ -2160,7 +2160,7 @@
                 <w:sz w:val="22"/>
                 <w:szCs w:val="22"/>
               </w:rPr>
-              <w:t xml:space="preserve">Description</w:t>
+              <w:t xml:space="preserve">Public Announcement Allowed</w:t>
             </w:r>
           </w:p>
         </w:tc>
@@ -2191,7 +2191,7 @@
                 <w:sz w:val="22"/>
                 <w:szCs w:val="22"/>
               </w:rPr>
-              <w:t xml:space="preserve">Rich Text</w:t>
+              <w:t xml:space="preserve">Yes/No</w:t>
             </w:r>
           </w:p>
         </w:tc>
@@ -2222,7 +2222,7 @@
                 <w:sz w:val="22"/>
                 <w:szCs w:val="22"/>
               </w:rPr>
-              <w:t xml:space="preserve">General description of the organization, its mission, programs, and any relevant context about the relationship. Optional.</w:t>
+              <w:t xml:space="preserve">Whether CBM may publicly announce or reference this partnership in its marketing and communications. Defaults to No.</w:t>
             </w:r>
           </w:p>
         </w:tc>
@@ -2255,7 +2255,7 @@
                 <w:sz w:val="22"/>
                 <w:szCs w:val="22"/>
               </w:rPr>
-              <w:t xml:space="preserve">Website</w:t>
+              <w:t xml:space="preserve">Description</w:t>
             </w:r>
           </w:p>
         </w:tc>
@@ -2286,7 +2286,7 @@
                 <w:sz w:val="22"/>
                 <w:szCs w:val="22"/>
               </w:rPr>
-              <w:t xml:space="preserve">URL</w:t>
+              <w:t xml:space="preserve">Rich Text</w:t>
             </w:r>
           </w:p>
         </w:tc>
@@ -2317,7 +2317,7 @@
                 <w:sz w:val="22"/>
                 <w:szCs w:val="22"/>
               </w:rPr>
-              <w:t xml:space="preserve">Partner organization's public website. Optional.</w:t>
+              <w:t xml:space="preserve">General description of the organization, its mission, programs, and any relevant context about the relationship. Optional.</w:t>
             </w:r>
           </w:p>
         </w:tc>
@@ -2350,7 +2350,7 @@
                 <w:sz w:val="22"/>
                 <w:szCs w:val="22"/>
               </w:rPr>
-              <w:t xml:space="preserve">Phone</w:t>
+              <w:t xml:space="preserve">Website</w:t>
             </w:r>
           </w:p>
         </w:tc>
@@ -2381,7 +2381,7 @@
                 <w:sz w:val="22"/>
                 <w:szCs w:val="22"/>
               </w:rPr>
-              <w:t xml:space="preserve">Phone</w:t>
+              <w:t xml:space="preserve">URL</w:t>
             </w:r>
           </w:p>
         </w:tc>
@@ -2412,7 +2412,7 @@
                 <w:sz w:val="22"/>
                 <w:szCs w:val="22"/>
               </w:rPr>
-              <w:t xml:space="preserve">Primary phone number for the organization. Optional.</w:t>
+              <w:t xml:space="preserve">Partner organization's public website. Optional.</w:t>
             </w:r>
           </w:p>
         </w:tc>
@@ -2445,7 +2445,7 @@
                 <w:sz w:val="22"/>
                 <w:szCs w:val="22"/>
               </w:rPr>
-              <w:t xml:space="preserve">Street Address</w:t>
+              <w:t xml:space="preserve">Phone</w:t>
             </w:r>
           </w:p>
         </w:tc>
@@ -2476,7 +2476,7 @@
                 <w:sz w:val="22"/>
                 <w:szCs w:val="22"/>
               </w:rPr>
-              <w:t xml:space="preserve">Text</w:t>
+              <w:t xml:space="preserve">Phone</w:t>
             </w:r>
           </w:p>
         </w:tc>
@@ -2507,7 +2507,7 @@
                 <w:sz w:val="22"/>
                 <w:szCs w:val="22"/>
               </w:rPr>
-              <w:t xml:space="preserve">Street address of the organization's primary office. Optional.</w:t>
+              <w:t xml:space="preserve">Primary phone number for the organization. Optional.</w:t>
             </w:r>
           </w:p>
         </w:tc>
@@ -2540,7 +2540,7 @@
                 <w:sz w:val="22"/>
                 <w:szCs w:val="22"/>
               </w:rPr>
-              <w:t xml:space="preserve">City</w:t>
+              <w:t xml:space="preserve">Street Address</w:t>
             </w:r>
           </w:p>
         </w:tc>
@@ -2602,7 +2602,7 @@
                 <w:sz w:val="22"/>
                 <w:szCs w:val="22"/>
               </w:rPr>
-              <w:t xml:space="preserve">City. Optional.</w:t>
+              <w:t xml:space="preserve">Street address of the organization's primary office. Optional.</w:t>
             </w:r>
           </w:p>
         </w:tc>
@@ -2635,7 +2635,7 @@
                 <w:sz w:val="22"/>
                 <w:szCs w:val="22"/>
               </w:rPr>
-              <w:t xml:space="preserve">State</w:t>
+              <w:t xml:space="preserve">City</w:t>
             </w:r>
           </w:p>
         </w:tc>
@@ -2697,7 +2697,7 @@
                 <w:sz w:val="22"/>
                 <w:szCs w:val="22"/>
               </w:rPr>
-              <w:t xml:space="preserve">State. Optional.</w:t>
+              <w:t xml:space="preserve">City. Optional.</w:t>
             </w:r>
           </w:p>
         </w:tc>
@@ -2730,7 +2730,7 @@
                 <w:sz w:val="22"/>
                 <w:szCs w:val="22"/>
               </w:rPr>
-              <w:t xml:space="preserve">ZIP Code</w:t>
+              <w:t xml:space="preserve">State</w:t>
             </w:r>
           </w:p>
         </w:tc>
@@ -2792,7 +2792,7 @@
                 <w:sz w:val="22"/>
                 <w:szCs w:val="22"/>
               </w:rPr>
-              <w:t xml:space="preserve">ZIP / postal code. Optional.</w:t>
+              <w:t xml:space="preserve">State. Optional.</w:t>
             </w:r>
           </w:p>
         </w:tc>
@@ -2825,7 +2825,7 @@
                 <w:sz w:val="22"/>
                 <w:szCs w:val="22"/>
               </w:rPr>
-              <w:t xml:space="preserve">Geographic Service Area</w:t>
+              <w:t xml:space="preserve">ZIP Code</w:t>
             </w:r>
           </w:p>
         </w:tc>
@@ -2856,7 +2856,7 @@
                 <w:sz w:val="22"/>
                 <w:szCs w:val="22"/>
               </w:rPr>
-              <w:t xml:space="preserve">Text / Multi-select</w:t>
+              <w:t xml:space="preserve">Text</w:t>
             </w:r>
           </w:p>
         </w:tc>
@@ -2887,7 +2887,7 @@
                 <w:sz w:val="22"/>
                 <w:szCs w:val="22"/>
               </w:rPr>
-              <w:t xml:space="preserve">The geographic territory or community the organization primarily serves (e.g., City of Cleveland, Cuyahoga County, Greater Akron). Optional.</w:t>
+              <w:t xml:space="preserve">ZIP / postal code. Optional.</w:t>
             </w:r>
           </w:p>
         </w:tc>
@@ -2920,7 +2920,7 @@
                 <w:sz w:val="22"/>
                 <w:szCs w:val="22"/>
               </w:rPr>
-              <w:t xml:space="preserve">Target Population</w:t>
+              <w:t xml:space="preserve">Geographic Service Area</w:t>
             </w:r>
           </w:p>
         </w:tc>
@@ -2982,7 +2982,7 @@
                 <w:sz w:val="22"/>
                 <w:szCs w:val="22"/>
               </w:rPr>
-              <w:t xml:space="preserve">The specific population or business segment the organization focuses on (e.g., minority-owned businesses, women entrepreneurs, tech startups, underserved communities). Optional.</w:t>
+              <w:t xml:space="preserve">The geographic territory or community the organization primarily serves (e.g., City of Cleveland, Cuyahoga County, Greater Akron). Optional.</w:t>
             </w:r>
           </w:p>
         </w:tc>
@@ -3015,7 +3015,7 @@
                 <w:sz w:val="22"/>
                 <w:szCs w:val="22"/>
               </w:rPr>
-              <w:t xml:space="preserve">Social Media</w:t>
+              <w:t xml:space="preserve">Target Population</w:t>
             </w:r>
           </w:p>
         </w:tc>
@@ -3046,7 +3046,7 @@
                 <w:sz w:val="22"/>
                 <w:szCs w:val="22"/>
               </w:rPr>
-              <w:t xml:space="preserve">Text</w:t>
+              <w:t xml:space="preserve">Text / Multi-select</w:t>
             </w:r>
           </w:p>
         </w:tc>
@@ -3077,7 +3077,7 @@
                 <w:sz w:val="22"/>
                 <w:szCs w:val="22"/>
               </w:rPr>
-              <w:t xml:space="preserve">Links to LinkedIn, Facebook, or other relevant social profiles. Optional.</w:t>
+              <w:t xml:space="preserve">The specific population or business segment the organization focuses on (e.g., minority-owned businesses, women entrepreneurs, tech startups, underserved communities). Optional.</w:t>
             </w:r>
           </w:p>
         </w:tc>
@@ -3110,6 +3110,101 @@
                 <w:sz w:val="22"/>
                 <w:szCs w:val="22"/>
               </w:rPr>
+              <w:t xml:space="preserve">Social Media</w:t>
+            </w:r>
+          </w:p>
+        </w:tc>
+        <w:tc>
+          <w:tcPr>
+            <w:tcW w:type="dxa" w:w="1800"/>
+            <w:tcBorders>
+              <w:top w:val="single" w:color="CCCCCC" w:sz="1"/>
+              <w:left w:val="single" w:color="CCCCCC" w:sz="1"/>
+              <w:bottom w:val="single" w:color="CCCCCC" w:sz="1"/>
+              <w:right w:val="single" w:color="CCCCCC" w:sz="1"/>
+            </w:tcBorders>
+            <w:shd w:fill="F5F9FF" w:val="clear"/>
+            <w:tcMar>
+              <w:top w:type="dxa" w:w="80"/>
+              <w:left w:type="dxa" w:w="120"/>
+              <w:bottom w:type="dxa" w:w="80"/>
+              <w:right w:type="dxa" w:w="120"/>
+            </w:tcMar>
+            <w:vAlign w:val="top"/>
+          </w:tcPr>
+          <w:p>
+            <w:r>
+              <w:rPr>
+                <w:rFonts w:ascii="Arial" w:cs="Arial" w:eastAsia="Arial" w:hAnsi="Arial"/>
+                <w:b w:val="false"/>
+                <w:bCs w:val="false"/>
+                <w:sz w:val="22"/>
+                <w:szCs w:val="22"/>
+              </w:rPr>
+              <w:t xml:space="preserve">Text</w:t>
+            </w:r>
+          </w:p>
+        </w:tc>
+        <w:tc>
+          <w:tcPr>
+            <w:tcW w:type="dxa" w:w="5160"/>
+            <w:tcBorders>
+              <w:top w:val="single" w:color="CCCCCC" w:sz="1"/>
+              <w:left w:val="single" w:color="CCCCCC" w:sz="1"/>
+              <w:bottom w:val="single" w:color="CCCCCC" w:sz="1"/>
+              <w:right w:val="single" w:color="CCCCCC" w:sz="1"/>
+            </w:tcBorders>
+            <w:shd w:fill="F5F9FF" w:val="clear"/>
+            <w:tcMar>
+              <w:top w:type="dxa" w:w="80"/>
+              <w:left w:type="dxa" w:w="120"/>
+              <w:bottom w:type="dxa" w:w="80"/>
+              <w:right w:type="dxa" w:w="120"/>
+            </w:tcMar>
+            <w:vAlign w:val="top"/>
+          </w:tcPr>
+          <w:p>
+            <w:r>
+              <w:rPr>
+                <w:rFonts w:ascii="Arial" w:cs="Arial" w:eastAsia="Arial" w:hAnsi="Arial"/>
+                <w:b w:val="false"/>
+                <w:bCs w:val="false"/>
+                <w:sz w:val="22"/>
+                <w:szCs w:val="22"/>
+              </w:rPr>
+              <w:t xml:space="preserve">Links to LinkedIn, Facebook, or other relevant social profiles. Optional.</w:t>
+            </w:r>
+          </w:p>
+        </w:tc>
+      </w:tr>
+      <w:tr>
+        <w:tc>
+          <w:tcPr>
+            <w:tcW w:type="dxa" w:w="2400"/>
+            <w:tcBorders>
+              <w:top w:val="single" w:color="CCCCCC" w:sz="1"/>
+              <w:left w:val="single" w:color="CCCCCC" w:sz="1"/>
+              <w:bottom w:val="single" w:color="CCCCCC" w:sz="1"/>
+              <w:right w:val="single" w:color="CCCCCC" w:sz="1"/>
+            </w:tcBorders>
+            <w:shd w:fill="FFFFFF" w:val="clear"/>
+            <w:tcMar>
+              <w:top w:type="dxa" w:w="80"/>
+              <w:left w:type="dxa" w:w="120"/>
+              <w:bottom w:type="dxa" w:w="80"/>
+              <w:right w:type="dxa" w:w="120"/>
+            </w:tcMar>
+            <w:vAlign w:val="top"/>
+          </w:tcPr>
+          <w:p>
+            <w:r>
+              <w:rPr>
+                <w:rFonts w:ascii="Arial" w:cs="Arial" w:eastAsia="Arial" w:hAnsi="Arial"/>
+                <w:b/>
+                <w:bCs/>
+                <w:sz w:val="22"/>
+                <w:szCs w:val="22"/>
+              </w:rPr>
               <w:t xml:space="preserve">Notes</w:t>
             </w:r>
           </w:p>
@@ -3123,7 +3218,7 @@
               <w:bottom w:val="single" w:color="CCCCCC" w:sz="1"/>
               <w:right w:val="single" w:color="CCCCCC" w:sz="1"/>
             </w:tcBorders>
-            <w:shd w:fill="F5F9FF" w:val="clear"/>
+            <w:shd w:fill="FFFFFF" w:val="clear"/>
             <w:tcMar>
               <w:top w:type="dxa" w:w="80"/>
               <w:left w:type="dxa" w:w="120"/>
@@ -3154,7 +3249,7 @@
               <w:bottom w:val="single" w:color="CCCCCC" w:sz="1"/>
               <w:right w:val="single" w:color="CCCCCC" w:sz="1"/>
             </w:tcBorders>
-            <w:shd w:fill="F5F9FF" w:val="clear"/>
+            <w:shd w:fill="FFFFFF" w:val="clear"/>
             <w:tcMar>
               <w:top w:type="dxa" w:w="80"/>
               <w:left w:type="dxa" w:w="120"/>
@@ -10044,6 +10139,70 @@
                 <w:sz w:val="22"/>
                 <w:szCs w:val="22"/>
               </w:rPr>
+              <w:t xml:space="preserve">Record Organization Type — Chamber of Commerce, SBDC, Economic Development Agency, University/Academic Institution, Bank/Financial Institution, Nonprofit/Community Organization, Government Agency, Corporate Sponsor, Other</w:t>
+            </w:r>
+          </w:p>
+        </w:tc>
+        <w:tc>
+          <w:tcPr>
+            <w:tcW w:type="dxa" w:w="2160"/>
+            <w:tcBorders>
+              <w:top w:val="single" w:color="CCCCCC" w:sz="1"/>
+              <w:left w:val="single" w:color="CCCCCC" w:sz="1"/>
+              <w:bottom w:val="single" w:color="CCCCCC" w:sz="1"/>
+              <w:right w:val="single" w:color="CCCCCC" w:sz="1"/>
+            </w:tcBorders>
+            <w:shd w:fill="F5F9FF" w:val="clear"/>
+            <w:tcMar>
+              <w:top w:type="dxa" w:w="80"/>
+              <w:left w:type="dxa" w:w="120"/>
+              <w:bottom w:type="dxa" w:w="80"/>
+              <w:right w:type="dxa" w:w="120"/>
+            </w:tcMar>
+            <w:vAlign w:val="top"/>
+          </w:tcPr>
+          <w:p>
+            <w:r>
+              <w:rPr>
+                <w:rFonts w:ascii="Arial" w:cs="Arial" w:eastAsia="Arial" w:hAnsi="Arial"/>
+                <w:b w:val="false"/>
+                <w:bCs w:val="false"/>
+                <w:sz w:val="22"/>
+                <w:szCs w:val="22"/>
+              </w:rPr>
+              <w:t xml:space="preserve">4</w:t>
+            </w:r>
+          </w:p>
+        </w:tc>
+      </w:tr>
+      <w:tr>
+        <w:tc>
+          <w:tcPr>
+            <w:tcW w:type="dxa" w:w="7200"/>
+            <w:tcBorders>
+              <w:top w:val="single" w:color="CCCCCC" w:sz="1"/>
+              <w:left w:val="single" w:color="CCCCCC" w:sz="1"/>
+              <w:bottom w:val="single" w:color="CCCCCC" w:sz="1"/>
+              <w:right w:val="single" w:color="CCCCCC" w:sz="1"/>
+            </w:tcBorders>
+            <w:shd w:fill="FFFFFF" w:val="clear"/>
+            <w:tcMar>
+              <w:top w:type="dxa" w:w="80"/>
+              <w:left w:type="dxa" w:w="120"/>
+              <w:bottom w:type="dxa" w:w="80"/>
+              <w:right w:type="dxa" w:w="120"/>
+            </w:tcMar>
+            <w:vAlign w:val="top"/>
+          </w:tcPr>
+          <w:p>
+            <w:r>
+              <w:rPr>
+                <w:rFonts w:ascii="Arial" w:cs="Arial" w:eastAsia="Arial" w:hAnsi="Arial"/>
+                <w:b w:val="false"/>
+                <w:bCs w:val="false"/>
+                <w:sz w:val="22"/>
+                <w:szCs w:val="22"/>
+              </w:rPr>
               <w:t xml:space="preserve">Assign and track Partner Type — Referral, Co-Delivery, Funding/Sponsorship, Resource — with multi-select support</w:t>
             </w:r>
           </w:p>
@@ -10057,7 +10216,7 @@
               <w:bottom w:val="single" w:color="CCCCCC" w:sz="1"/>
               <w:right w:val="single" w:color="CCCCCC" w:sz="1"/>
             </w:tcBorders>
-            <w:shd w:fill="F5F9FF" w:val="clear"/>
+            <w:shd w:fill="FFFFFF" w:val="clear"/>
             <w:tcMar>
               <w:top w:type="dxa" w:w="80"/>
               <w:left w:type="dxa" w:w="120"/>
@@ -10090,7 +10249,7 @@
               <w:bottom w:val="single" w:color="CCCCCC" w:sz="1"/>
               <w:right w:val="single" w:color="CCCCCC" w:sz="1"/>
             </w:tcBorders>
-            <w:shd w:fill="FFFFFF" w:val="clear"/>
+            <w:shd w:fill="F5F9FF" w:val="clear"/>
             <w:tcMar>
               <w:top w:type="dxa" w:w="80"/>
               <w:left w:type="dxa" w:w="120"/>
@@ -10121,7 +10280,7 @@
               <w:bottom w:val="single" w:color="CCCCCC" w:sz="1"/>
               <w:right w:val="single" w:color="CCCCCC" w:sz="1"/>
             </w:tcBorders>
-            <w:shd w:fill="FFFFFF" w:val="clear"/>
+            <w:shd w:fill="F5F9FF" w:val="clear"/>
             <w:tcMar>
               <w:top w:type="dxa" w:w="80"/>
               <w:left w:type="dxa" w:w="120"/>
@@ -10154,7 +10313,7 @@
               <w:bottom w:val="single" w:color="CCCCCC" w:sz="1"/>
               <w:right w:val="single" w:color="CCCCCC" w:sz="1"/>
             </w:tcBorders>
-            <w:shd w:fill="F5F9FF" w:val="clear"/>
+            <w:shd w:fill="FFFFFF" w:val="clear"/>
             <w:tcMar>
               <w:top w:type="dxa" w:w="80"/>
               <w:left w:type="dxa" w:w="120"/>
@@ -10185,7 +10344,7 @@
               <w:bottom w:val="single" w:color="CCCCCC" w:sz="1"/>
               <w:right w:val="single" w:color="CCCCCC" w:sz="1"/>
             </w:tcBorders>
-            <w:shd w:fill="F5F9FF" w:val="clear"/>
+            <w:shd w:fill="FFFFFF" w:val="clear"/>
             <w:tcMar>
               <w:top w:type="dxa" w:w="80"/>
               <w:left w:type="dxa" w:w="120"/>
@@ -10218,7 +10377,7 @@
               <w:bottom w:val="single" w:color="CCCCCC" w:sz="1"/>
               <w:right w:val="single" w:color="CCCCCC" w:sz="1"/>
             </w:tcBorders>
-            <w:shd w:fill="FFFFFF" w:val="clear"/>
+            <w:shd w:fill="F5F9FF" w:val="clear"/>
             <w:tcMar>
               <w:top w:type="dxa" w:w="80"/>
               <w:left w:type="dxa" w:w="120"/>
@@ -10249,7 +10408,7 @@
               <w:bottom w:val="single" w:color="CCCCCC" w:sz="1"/>
               <w:right w:val="single" w:color="CCCCCC" w:sz="1"/>
             </w:tcBorders>
-            <w:shd w:fill="FFFFFF" w:val="clear"/>
+            <w:shd w:fill="F5F9FF" w:val="clear"/>
             <w:tcMar>
               <w:top w:type="dxa" w:w="80"/>
               <w:left w:type="dxa" w:w="120"/>
@@ -10282,7 +10441,7 @@
               <w:bottom w:val="single" w:color="CCCCCC" w:sz="1"/>
               <w:right w:val="single" w:color="CCCCCC" w:sz="1"/>
             </w:tcBorders>
-            <w:shd w:fill="F5F9FF" w:val="clear"/>
+            <w:shd w:fill="FFFFFF" w:val="clear"/>
             <w:tcMar>
               <w:top w:type="dxa" w:w="80"/>
               <w:left w:type="dxa" w:w="120"/>
@@ -10313,7 +10472,7 @@
               <w:bottom w:val="single" w:color="CCCCCC" w:sz="1"/>
               <w:right w:val="single" w:color="CCCCCC" w:sz="1"/>
             </w:tcBorders>
-            <w:shd w:fill="F5F9FF" w:val="clear"/>
+            <w:shd w:fill="FFFFFF" w:val="clear"/>
             <w:tcMar>
               <w:top w:type="dxa" w:w="80"/>
               <w:left w:type="dxa" w:w="120"/>
@@ -10346,7 +10505,7 @@
               <w:bottom w:val="single" w:color="CCCCCC" w:sz="1"/>
               <w:right w:val="single" w:color="CCCCCC" w:sz="1"/>
             </w:tcBorders>
-            <w:shd w:fill="FFFFFF" w:val="clear"/>
+            <w:shd w:fill="F5F9FF" w:val="clear"/>
             <w:tcMar>
               <w:top w:type="dxa" w:w="80"/>
               <w:left w:type="dxa" w:w="120"/>
@@ -10377,7 +10536,7 @@
               <w:bottom w:val="single" w:color="CCCCCC" w:sz="1"/>
               <w:right w:val="single" w:color="CCCCCC" w:sz="1"/>
             </w:tcBorders>
-            <w:shd w:fill="FFFFFF" w:val="clear"/>
+            <w:shd w:fill="F5F9FF" w:val="clear"/>
             <w:tcMar>
               <w:top w:type="dxa" w:w="80"/>
               <w:left w:type="dxa" w:w="120"/>
@@ -10410,7 +10569,7 @@
               <w:bottom w:val="single" w:color="CCCCCC" w:sz="1"/>
               <w:right w:val="single" w:color="CCCCCC" w:sz="1"/>
             </w:tcBorders>
-            <w:shd w:fill="F5F9FF" w:val="clear"/>
+            <w:shd w:fill="FFFFFF" w:val="clear"/>
             <w:tcMar>
               <w:top w:type="dxa" w:w="80"/>
               <w:left w:type="dxa" w:w="120"/>
@@ -10441,7 +10600,7 @@
               <w:bottom w:val="single" w:color="CCCCCC" w:sz="1"/>
               <w:right w:val="single" w:color="CCCCCC" w:sz="1"/>
             </w:tcBorders>
-            <w:shd w:fill="F5F9FF" w:val="clear"/>
+            <w:shd w:fill="FFFFFF" w:val="clear"/>
             <w:tcMar>
               <w:top w:type="dxa" w:w="80"/>
               <w:left w:type="dxa" w:w="120"/>
@@ -10474,7 +10633,7 @@
               <w:bottom w:val="single" w:color="CCCCCC" w:sz="1"/>
               <w:right w:val="single" w:color="CCCCCC" w:sz="1"/>
             </w:tcBorders>
-            <w:shd w:fill="FFFFFF" w:val="clear"/>
+            <w:shd w:fill="F5F9FF" w:val="clear"/>
             <w:tcMar>
               <w:top w:type="dxa" w:w="80"/>
               <w:left w:type="dxa" w:w="120"/>
@@ -10505,7 +10664,7 @@
               <w:bottom w:val="single" w:color="CCCCCC" w:sz="1"/>
               <w:right w:val="single" w:color="CCCCCC" w:sz="1"/>
             </w:tcBorders>
-            <w:shd w:fill="FFFFFF" w:val="clear"/>
+            <w:shd w:fill="F5F9FF" w:val="clear"/>
             <w:tcMar>
               <w:top w:type="dxa" w:w="80"/>
               <w:left w:type="dxa" w:w="120"/>
@@ -10538,7 +10697,7 @@
               <w:bottom w:val="single" w:color="CCCCCC" w:sz="1"/>
               <w:right w:val="single" w:color="CCCCCC" w:sz="1"/>
             </w:tcBorders>
-            <w:shd w:fill="F5F9FF" w:val="clear"/>
+            <w:shd w:fill="FFFFFF" w:val="clear"/>
             <w:tcMar>
               <w:top w:type="dxa" w:w="80"/>
               <w:left w:type="dxa" w:w="120"/>
@@ -10569,7 +10728,7 @@
               <w:bottom w:val="single" w:color="CCCCCC" w:sz="1"/>
               <w:right w:val="single" w:color="CCCCCC" w:sz="1"/>
             </w:tcBorders>
-            <w:shd w:fill="F5F9FF" w:val="clear"/>
+            <w:shd w:fill="FFFFFF" w:val="clear"/>
             <w:tcMar>
               <w:top w:type="dxa" w:w="80"/>
               <w:left w:type="dxa" w:w="120"/>
@@ -10602,7 +10761,7 @@
               <w:bottom w:val="single" w:color="CCCCCC" w:sz="1"/>
               <w:right w:val="single" w:color="CCCCCC" w:sz="1"/>
             </w:tcBorders>
-            <w:shd w:fill="FFFFFF" w:val="clear"/>
+            <w:shd w:fill="F5F9FF" w:val="clear"/>
             <w:tcMar>
               <w:top w:type="dxa" w:w="80"/>
               <w:left w:type="dxa" w:w="120"/>
@@ -10633,7 +10792,7 @@
               <w:bottom w:val="single" w:color="CCCCCC" w:sz="1"/>
               <w:right w:val="single" w:color="CCCCCC" w:sz="1"/>
             </w:tcBorders>
-            <w:shd w:fill="FFFFFF" w:val="clear"/>
+            <w:shd w:fill="F5F9FF" w:val="clear"/>
             <w:tcMar>
               <w:top w:type="dxa" w:w="80"/>
               <w:left w:type="dxa" w:w="120"/>
@@ -10666,7 +10825,7 @@
               <w:bottom w:val="single" w:color="CCCCCC" w:sz="1"/>
               <w:right w:val="single" w:color="CCCCCC" w:sz="1"/>
             </w:tcBorders>
-            <w:shd w:fill="F5F9FF" w:val="clear"/>
+            <w:shd w:fill="FFFFFF" w:val="clear"/>
             <w:tcMar>
               <w:top w:type="dxa" w:w="80"/>
               <w:left w:type="dxa" w:w="120"/>
@@ -10697,7 +10856,7 @@
               <w:bottom w:val="single" w:color="CCCCCC" w:sz="1"/>
               <w:right w:val="single" w:color="CCCCCC" w:sz="1"/>
             </w:tcBorders>
-            <w:shd w:fill="F5F9FF" w:val="clear"/>
+            <w:shd w:fill="FFFFFF" w:val="clear"/>
             <w:tcMar>
               <w:top w:type="dxa" w:w="80"/>
               <w:left w:type="dxa" w:w="120"/>
@@ -10730,7 +10889,7 @@
               <w:bottom w:val="single" w:color="CCCCCC" w:sz="1"/>
               <w:right w:val="single" w:color="CCCCCC" w:sz="1"/>
             </w:tcBorders>
-            <w:shd w:fill="FFFFFF" w:val="clear"/>
+            <w:shd w:fill="F5F9FF" w:val="clear"/>
             <w:tcMar>
               <w:top w:type="dxa" w:w="80"/>
               <w:left w:type="dxa" w:w="120"/>
@@ -10761,7 +10920,7 @@
               <w:bottom w:val="single" w:color="CCCCCC" w:sz="1"/>
               <w:right w:val="single" w:color="CCCCCC" w:sz="1"/>
             </w:tcBorders>
-            <w:shd w:fill="FFFFFF" w:val="clear"/>
+            <w:shd w:fill="F5F9FF" w:val="clear"/>
             <w:tcMar>
               <w:top w:type="dxa" w:w="80"/>
               <w:left w:type="dxa" w:w="120"/>
@@ -14826,7 +14985,7 @@
                 <w:sz w:val="22"/>
                 <w:szCs w:val="22"/>
               </w:rPr>
-              <w:t xml:space="preserve">0.3</w:t>
+              <w:t xml:space="preserve">0.4</w:t>
             </w:r>
           </w:p>
         </w:tc>
@@ -16688,6 +16847,134 @@
                 <w:szCs w:val="22"/>
               </w:rPr>
               <w:t xml:space="preserve">CBM needs to support a parent-child relationship between Partner organizations. For example, a local branch or chapter of a larger organization should be linkable to its parent (e.g., a bank with multiple branches, or a national org with a local chapter). Both parent and child are independent Partner records.</w:t>
+            </w:r>
+          </w:p>
+        </w:tc>
+      </w:tr>
+      <w:tr>
+        <w:tc>
+          <w:tcPr>
+            <w:tcW w:type="dxa" w:w="3600"/>
+            <w:tcBorders>
+              <w:top w:val="single" w:color="CCCCCC" w:sz="1"/>
+              <w:left w:val="single" w:color="CCCCCC" w:sz="1"/>
+              <w:bottom w:val="single" w:color="CCCCCC" w:sz="1"/>
+              <w:right w:val="single" w:color="CCCCCC" w:sz="1"/>
+            </w:tcBorders>
+            <w:shd w:fill="F5F9FF" w:val="clear"/>
+            <w:tcMar>
+              <w:top w:type="dxa" w:w="80"/>
+              <w:left w:type="dxa" w:w="120"/>
+              <w:bottom w:type="dxa" w:w="80"/>
+              <w:right w:type="dxa" w:w="120"/>
+            </w:tcMar>
+            <w:vAlign w:val="top"/>
+          </w:tcPr>
+          <w:p>
+            <w:r>
+              <w:rPr>
+                <w:rFonts w:ascii="Arial" w:cs="Arial" w:eastAsia="Arial" w:hAnsi="Arial"/>
+                <w:b/>
+                <w:bCs/>
+                <w:sz w:val="22"/>
+                <w:szCs w:val="22"/>
+              </w:rPr>
+              <w:t xml:space="preserve">Post-Discovery: CRM Entity Decision — Should Partners use EspoCRM's Accounts entity or a custom entity?</w:t>
+            </w:r>
+          </w:p>
+        </w:tc>
+        <w:tc>
+          <w:tcPr>
+            <w:tcW w:type="dxa" w:w="5760"/>
+            <w:tcBorders>
+              <w:top w:val="single" w:color="CCCCCC" w:sz="1"/>
+              <w:left w:val="single" w:color="CCCCCC" w:sz="1"/>
+              <w:bottom w:val="single" w:color="CCCCCC" w:sz="1"/>
+              <w:right w:val="single" w:color="CCCCCC" w:sz="1"/>
+            </w:tcBorders>
+            <w:shd w:fill="F5F9FF" w:val="clear"/>
+            <w:tcMar>
+              <w:top w:type="dxa" w:w="80"/>
+              <w:left w:type="dxa" w:w="120"/>
+              <w:bottom w:type="dxa" w:w="80"/>
+              <w:right w:type="dxa" w:w="120"/>
+            </w:tcMar>
+            <w:vAlign w:val="top"/>
+          </w:tcPr>
+          <w:p>
+            <w:r>
+              <w:rPr>
+                <w:rFonts w:ascii="Arial" w:cs="Arial" w:eastAsia="Arial" w:hAnsi="Arial"/>
+                <w:b w:val="false"/>
+                <w:bCs w:val="false"/>
+                <w:sz w:val="22"/>
+                <w:szCs w:val="22"/>
+              </w:rPr>
+              <w:t xml:space="preserve">Resolved during PRD review (see Section 15). Partners will be modeled using EspoCRM's native Accounts entity alongside Client Companies. A single Account entity covers all organizations. Account Type field plus Dynamic Logic panels and filtered view presets replicate the pattern already used on the Contact entity for Mentors and Clients. Using a custom entity would create two disconnected pools of organization records and significant risk of duplicate entries.</w:t>
+            </w:r>
+          </w:p>
+        </w:tc>
+      </w:tr>
+      <w:tr>
+        <w:tc>
+          <w:tcPr>
+            <w:tcW w:type="dxa" w:w="3600"/>
+            <w:tcBorders>
+              <w:top w:val="single" w:color="CCCCCC" w:sz="1"/>
+              <w:left w:val="single" w:color="CCCCCC" w:sz="1"/>
+              <w:bottom w:val="single" w:color="CCCCCC" w:sz="1"/>
+              <w:right w:val="single" w:color="CCCCCC" w:sz="1"/>
+            </w:tcBorders>
+            <w:shd w:fill="FFFFFF" w:val="clear"/>
+            <w:tcMar>
+              <w:top w:type="dxa" w:w="80"/>
+              <w:left w:type="dxa" w:w="120"/>
+              <w:bottom w:type="dxa" w:w="80"/>
+              <w:right w:type="dxa" w:w="120"/>
+            </w:tcMar>
+            <w:vAlign w:val="top"/>
+          </w:tcPr>
+          <w:p>
+            <w:r>
+              <w:rPr>
+                <w:rFonts w:ascii="Arial" w:cs="Arial" w:eastAsia="Arial" w:hAnsi="Arial"/>
+                <w:b/>
+                <w:bCs/>
+                <w:sz w:val="22"/>
+                <w:szCs w:val="22"/>
+              </w:rPr>
+              <w:t xml:space="preserve">Post-Discovery: Organization Type — Should CBM track the category of organization a Partner represents?</w:t>
+            </w:r>
+          </w:p>
+        </w:tc>
+        <w:tc>
+          <w:tcPr>
+            <w:tcW w:type="dxa" w:w="5760"/>
+            <w:tcBorders>
+              <w:top w:val="single" w:color="CCCCCC" w:sz="1"/>
+              <w:left w:val="single" w:color="CCCCCC" w:sz="1"/>
+              <w:bottom w:val="single" w:color="CCCCCC" w:sz="1"/>
+              <w:right w:val="single" w:color="CCCCCC" w:sz="1"/>
+            </w:tcBorders>
+            <w:shd w:fill="FFFFFF" w:val="clear"/>
+            <w:tcMar>
+              <w:top w:type="dxa" w:w="80"/>
+              <w:left w:type="dxa" w:w="120"/>
+              <w:bottom w:type="dxa" w:w="80"/>
+              <w:right w:type="dxa" w:w="120"/>
+            </w:tcMar>
+            <w:vAlign w:val="top"/>
+          </w:tcPr>
+          <w:p>
+            <w:r>
+              <w:rPr>
+                <w:rFonts w:ascii="Arial" w:cs="Arial" w:eastAsia="Arial" w:hAnsi="Arial"/>
+                <w:b w:val="false"/>
+                <w:bCs w:val="false"/>
+                <w:sz w:val="22"/>
+                <w:szCs w:val="22"/>
+              </w:rPr>
+              <w:t xml:space="preserve">Identified during PRD review as a missing field. Organization Type is a single-select dropdown field added to the Partner profile (Section 5.1) and Section 14.1 requirements. Initial values: Chamber of Commerce, Small Business Development Center (SBDC), Economic Development Agency, University / Academic Institution, Bank / Financial Institution, Nonprofit / Community Organization, Government Agency, Corporate Sponsor, Other. Values may be expanded as CBM's partner network grows.</w:t>
             </w:r>
           </w:p>
         </w:tc>

</xml_diff>